<commit_message>
ENT 141 as 1-2-2: 1-hour lecture + 2-hour lab, 2 credits
Co-Authored-By: Claude Opus 5.5 <noreply@anthropic.com>
Claude-Session: https://claude.ai/code/session_01QC4xbs3DBBWiTW38zffG9q
</commit_message>
<xml_diff>
--- a/files/ENT141-Syllabus-Suggested.docx
+++ b/files/ENT141-Syllabus-Suggested.docx
@@ -606,31 +606,7 @@
                 <w:szCs w:val="24"/>
                 <w:lang w:val="en-GB"/>
               </w:rPr>
-              <w:t>2</w:t>
-            </w:r>
-            <w:r>
-              <w:rPr>
-                <w:rFonts w:eastAsia="Times New Roman" w:cstheme="minorHAnsi"/>
-                <w:sz w:val="24"/>
-                <w:szCs w:val="24"/>
-                <w:lang w:val="en-GB"/>
-              </w:rPr>
-              <w:t>-0-</w:t>
-            </w:r>
-            <w:r>
-              <w:rPr>
-                <w:rFonts w:eastAsia="Times New Roman" w:cstheme="minorHAnsi"/>
-                <w:sz w:val="24"/>
-                <w:szCs w:val="24"/>
-                <w:lang w:val="en-GB"/>
-              </w:rPr>
-              <w:t>2</w:t>
-            </w:r>
-            <w:r>
-              <w:rPr>
-                <w:highlight w:val="yellow"/>
-              </w:rPr>
-              <w:t xml:space="preserve"> (credit split to be confirmed by the department)</w:t>
+              <w:t xml:space="preserve">1-2-2 (1-hour lecture, 2-hour lab, 2 credits)</w:t>
             </w:r>
           </w:p>
         </w:tc>
@@ -691,7 +667,7 @@
                 <w:szCs w:val="24"/>
                 <w:lang w:val="en-GB"/>
               </w:rPr>
-              <w:t xml:space="preserve">Lec [15 Hrs], Lab/Non-Lec [15 Hrs] Total: 30 Hrs (1-hour lecture + 1-hour lab weekly)</w:t>
+              <w:t xml:space="preserve">Lec [15 Hrs], Lab/Non-Lec [30 Hrs] Total: 45 Hrs (1-hour lecture + 2-hour lab weekly)</w:t>
             </w:r>
           </w:p>
         </w:tc>
@@ -1692,7 +1668,7 @@
           <w:sz w:val="24"/>
           <w:szCs w:val="24"/>
         </w:rPr>
-        <w:t xml:space="preserve">The course builds an entrepreneurial mindset and the skills to discover and design. Students find real problems on campus, in the UAE and through the CUD Incubator's challenge cards, research them through observation and interviews, and build evidence-based personas. They use design thinking, associating, biomimicry and open innovation to generate and select ideas, turn one concept into a paper prototype, and present it at the Innovation Challenge Final with a 90-day roadmap. Each week has a 1-hour lecture and a 1-hour lab. Business models and market analysis follow in ENT 241.</w:t>
+        <w:t xml:space="preserve">The course builds an entrepreneurial mindset and the skills to discover and design. Students find real problems on campus, in the UAE and through the CUD Incubator's challenge cards, research them through observation and interviews, and build evidence-based personas. They use design thinking, associating, biomimicry and open innovation to generate and select ideas, turn one concept into a paper prototype, and present it at the Innovation Challenge Final with a 90-day roadmap. Each week has a 1-hour lecture and a 2-hour lab. Business models and market analysis follow in ENT 241.</w:t>
       </w:r>
     </w:p>
     <w:p>
@@ -5916,7 +5892,7 @@
           <w:szCs w:val="24"/>
           <w:lang w:bidi="ar-EG"/>
         </w:rPr>
-        <w:t xml:space="preserve">The 1-hour weekly lab runs the in-class activity listed for each week in 4.1.</w:t>
+        <w:t xml:space="preserve">The 2-hour weekly lab runs the in-class activity listed for each week in 4.1.</w:t>
       </w:r>
     </w:p>
     <w:p>
@@ -6002,7 +5978,7 @@
           <w:sz w:val="24"/>
           <w:szCs w:val="24"/>
         </w:rPr>
-        <w:t xml:space="preserve">The course runs as a weekly 1-hour lecture followed by a 1-hour lab. Each lecture introduces one concept from the textbook through definitions, real UAE examples and a framework applied step by step; each lab is a named, hands-on experiential activity (Section 4.1). Students work in teams with rotating roles (leader, timekeeper, recorder, speaker) and keep a teamwork log. Guest speakers and workshops: a founder or young entrepreneur talk; a creativity, brainstorming and biomimicry workshop; the Innovation Challenge and Gallery Walk. Students are encouraged to take part in hackathons, innovation challenges and competitions at CUD and UAE level, including challenges published by the CUD Incubator. Materials follow Universal Design for Learning (simplified Easy view, read-aloud, step-by-step task cards and a choice of how to show learning); individual adjustments follow CUD's student-support process.</w:t>
+        <w:t xml:space="preserve">The course runs as a weekly 1-hour lecture followed by a 2-hour lab. Each lecture introduces one concept from the textbook through definitions, real UAE examples and a framework applied step by step; each lab is a named, hands-on experiential activity (Section 4.1). Students work in teams with rotating roles (leader, timekeeper, recorder, speaker) and keep a teamwork log. Guest speakers and workshops: a founder or young entrepreneur talk; a creativity, brainstorming and biomimicry workshop; the Innovation Challenge and Gallery Walk. Students are encouraged to take part in hackathons, innovation challenges and competitions at CUD and UAE level, including challenges published by the CUD Incubator. Materials follow Universal Design for Learning (simplified Easy view, read-aloud, step-by-step task cards and a choice of how to show learning); individual adjustments follow CUD's student-support process.</w:t>
       </w:r>
     </w:p>
     <w:p>

</xml_diff>

<commit_message>
Teaching methodology: lecture and lab only, entrepreneur input inside class hours; ENT 141 A2 becomes a written research evidence pack (no defense)
Co-Authored-By: Claude Opus 5.5 <noreply@anthropic.com>
Claude-Session: https://claude.ai/code/session_01QC4xbs3DBBWiTW38zffG9q
</commit_message>
<xml_diff>
--- a/files/ENT141-Syllabus-Suggested.docx
+++ b/files/ENT141-Syllabus-Suggested.docx
@@ -2753,7 +2753,7 @@
                 <w:szCs w:val="20"/>
                 <w:b w:val="0"/>
               </w:rPr>
-              <w:t xml:space="preserve">Lab: Entrepreneurial Mindset Challenge · guest founder talk</w:t>
+              <w:t xml:space="preserve">Lab: Entrepreneurial Mindset Challenge: founder stories</w:t>
             </w:r>
           </w:p>
         </w:tc>
@@ -4139,7 +4139,7 @@
                 <w:szCs w:val="20"/>
                 <w:b w:val="0"/>
               </w:rPr>
-              <w:t xml:space="preserve">Lab: Research Defense</w:t>
+              <w:t xml:space="preserve">Lab: Evidence Check: every claim has evidence</w:t>
             </w:r>
           </w:p>
         </w:tc>
@@ -4219,7 +4219,7 @@
               <w:rPr>
                 <w:b/>
               </w:rPr>
-              <w:t xml:space="preserve">A2 Research Defense</w:t>
+              <w:t xml:space="preserve">A2 Research Evidence Pack</w:t>
             </w:r>
           </w:p>
         </w:tc>
@@ -4736,7 +4736,7 @@
                 <w:szCs w:val="20"/>
                 <w:b w:val="0"/>
               </w:rPr>
-              <w:t xml:space="preserve">Lab: Idea Tournament: select and defend one concept</w:t>
+              <w:t xml:space="preserve">Lab: Idea Tournament: select and justify one concept</w:t>
             </w:r>
           </w:p>
         </w:tc>
@@ -5978,7 +5978,7 @@
           <w:sz w:val="24"/>
           <w:szCs w:val="24"/>
         </w:rPr>
-        <w:t xml:space="preserve">The course runs as a weekly 1-hour lecture followed by a 2-hour lab. Each lecture introduces one concept from the textbook through definitions, real UAE examples and a framework applied step by step; each lab is a named, hands-on experiential activity (Section 4.1). Students work in teams with rotating roles (leader, timekeeper, recorder, speaker) and keep a teamwork log. Guest speakers and workshops: a founder or young entrepreneur talk; a creativity, brainstorming and biomimicry workshop; the Innovation Challenge and Gallery Walk. Students are encouraged to take part in hackathons, innovation challenges and competitions at CUD and UAE level, including challenges published by the CUD Incubator. Materials follow Universal Design for Learning (simplified Easy view, read-aloud, step-by-step task cards and a choice of how to show learning); individual adjustments follow CUD's student-support process.</w:t>
+        <w:t xml:space="preserve">The course is taught as a weekly 1-hour lecture and a 2-hour lab (1-2-2). In the lecture, the instructor presents one concept from the textbook with real UAE examples and the framework applied step by step. In the lab, students apply it in one hands-on activity (Section 4.1). Students work in teams with rotating roles (leader, timekeeper, recorder, speaker) and keep a teamwork log. Some lectures or labs may include a short contribution from a practising entrepreneur or a CUD Incubator partner, within the scheduled class time; this does not add contact hours and does not replace the lecture or the lab. Students are encouraged to take part in hackathons, innovation challenges and competitions at CUD and UAE level, including challenges published by the CUD Incubator. Materials follow Universal Design for Learning (simplified Easy view, read-aloud, step-by-step task cards and a choice of how to show learning); individual adjustments follow CUD's student-support process.</w:t>
       </w:r>
     </w:p>
     <w:p>
@@ -6891,7 +6891,7 @@
               <w:rPr>
                 <w:rFonts w:ascii="Calibri" w:hAnsi="Calibri" w:cs="Calibri"/>
               </w:rPr>
-              <w:t xml:space="preserve">Research defense (Week 8)</w:t>
+              <w:t xml:space="preserve">Research evidence pack (Week 8)</w:t>
             </w:r>
           </w:p>
         </w:tc>
@@ -7408,7 +7408,7 @@
           <w:szCs w:val="24"/>
           <w:b/>
         </w:rPr>
-        <w:t xml:space="preserve">A2 – Research defense (Team, Week 8, 25%): </w:t>
+        <w:t xml:space="preserve">A2 – Research evidence pack (Team, Week 8, 25%): </w:t>
       </w:r>
       <w:r>
         <w:rPr>
@@ -7419,7 +7419,7 @@
           <w:szCs w:val="24"/>
           <w:b w:val="0"/>
         </w:rPr>
-        <w:t xml:space="preserve">Interview evidence, Evidence Wall insights and an evidence-based persona, defended in class.</w:t>
+        <w:t xml:space="preserve">Interview notes, Evidence Wall insights and an evidence-based persona, completed in writing in class. No presentation.</w:t>
       </w:r>
     </w:p>
     <w:p>
@@ -10572,7 +10572,7 @@
           <w:szCs w:val="24"/>
         </w:rPr>
         <w:lastRenderedPageBreak/>
-        <w:t xml:space="preserve">Grading Rubric for A2: Research defense (25 marks)</w:t>
+        <w:t xml:space="preserve">Grading Rubric for A2: Research evidence pack (25 marks)</w:t>
       </w:r>
     </w:p>
     <w:tbl>
@@ -10629,7 +10629,7 @@
                 <w:sz w:val="16"/>
                 <w:szCs w:val="16"/>
               </w:rPr>
-              <w:t xml:space="preserve">A2: Research defense</w:t>
+              <w:t xml:space="preserve">A2: Research evidence pack</w:t>
             </w:r>
           </w:p>
         </w:tc>
@@ -11189,7 +11189,7 @@
                 <w:sz w:val="16"/>
                 <w:szCs w:val="16"/>
               </w:rPr>
-              <w:t xml:space="preserve">Defense (5 marks)</w:t>
+              <w:t xml:space="preserve">Clarity (5 marks)</w:t>
             </w:r>
           </w:p>
         </w:tc>

</xml_diff>

<commit_message>
One source for the suggested syllabus text: review pages, full syllabus page and Word/PDF now say the same
Co-Authored-By: Claude Opus 5.5 <noreply@anthropic.com>
Claude-Session: https://claude.ai/code/session_01QC4xbs3DBBWiTW38zffG9q
</commit_message>
<xml_diff>
--- a/files/ENT141-Syllabus-Suggested.docx
+++ b/files/ENT141-Syllabus-Suggested.docx
@@ -574,6 +574,68 @@
             <w:r>
               <w:rPr>
                 <w:rFonts w:eastAsia="Times New Roman" w:cstheme="minorHAnsi"/>
+                <w:bCs/>
+                <w:sz w:val="24"/>
+                <w:szCs w:val="24"/>
+                <w:lang w:val="en-GB"/>
+                <w:b/>
+              </w:rPr>
+              <w:t xml:space="preserve">Course Identity:</w:t>
+            </w:r>
+          </w:p>
+        </w:tc>
+        <w:tc>
+          <w:tcPr>
+            <w:tcW w:w="3666" w:type="pct"/>
+            <w:gridSpan w:val="4"/>
+            <w:vAlign w:val="center"/>
+          </w:tcPr>
+          <w:p>
+            <w:pPr>
+              <w:spacing w:after="0" w:line="240" w:lineRule="auto"/>
+              <w:rPr>
+                <w:rFonts w:eastAsia="Times New Roman" w:cstheme="minorHAnsi"/>
+                <w:sz w:val="24"/>
+                <w:szCs w:val="24"/>
+                <w:lang w:val="en-GB"/>
+              </w:rPr>
+            </w:pPr>
+            <w:r>
+              <w:rPr>
+                <w:rFonts w:eastAsia="Times New Roman" w:cstheme="minorHAnsi"/>
+                <w:sz w:val="24"/>
+                <w:szCs w:val="24"/>
+                <w:lang w:val="en-GB"/>
+              </w:rPr>
+              <w:t xml:space="preserve">Discover &amp; Design · Year 1 of the ENT journey</w:t>
+            </w:r>
+          </w:p>
+        </w:tc>
+      </w:tr>
+      <w:tr>
+        <w:trPr>
+          <w:trHeight w:val="360"/>
+        </w:trPr>
+        <w:tc>
+          <w:tcPr>
+            <w:tcW w:w="1334" w:type="pct"/>
+            <w:vAlign w:val="center"/>
+          </w:tcPr>
+          <w:p>
+            <w:pPr>
+              <w:spacing w:after="0" w:line="240" w:lineRule="auto"/>
+              <w:rPr>
+                <w:rFonts w:eastAsia="Times New Roman" w:cstheme="minorHAnsi"/>
+                <w:b/>
+                <w:bCs/>
+                <w:sz w:val="24"/>
+                <w:szCs w:val="24"/>
+                <w:lang w:val="en-GB"/>
+              </w:rPr>
+            </w:pPr>
+            <w:r>
+              <w:rPr>
+                <w:rFonts w:eastAsia="Times New Roman" w:cstheme="minorHAnsi"/>
                 <w:b/>
                 <w:bCs/>
                 <w:sz w:val="24"/>
@@ -5962,7 +6024,7 @@
     </w:p>
     <w:p>
       <w:pPr>
-        <w:spacing w:after="0" w:line="240" w:lineRule="auto"/>
+        <w:spacing w:after="120" w:line="240" w:lineRule="auto"/>
         <w:jc w:val="both"/>
         <w:rPr>
           <w:rFonts w:cstheme="minorHAnsi"/>
@@ -5977,8 +6039,85 @@
           <w:color w:val="000000" w:themeColor="text1"/>
           <w:sz w:val="24"/>
           <w:szCs w:val="24"/>
+          <w:b w:val="0"/>
         </w:rPr>
-        <w:t xml:space="preserve">The course is taught as a weekly 1-hour lecture and a 2-hour lab (1-2-2). In the lecture, the instructor presents one concept from the textbook with real UAE examples and the framework applied step by step. In the lab, students apply it in one hands-on activity (Section 4.1). Students work in teams with rotating roles (leader, timekeeper, recorder, speaker) and keep a teamwork log. Some lectures or labs may include a short contribution from a practising entrepreneur or a CUD Incubator partner, within the scheduled class time; this does not add contact hours and does not replace the lecture or the lab. Students are encouraged to take part in hackathons, innovation challenges and competitions at CUD and UAE level, including challenges published by the CUD Incubator. Materials follow Universal Design for Learning (simplified Easy view, read-aloud, step-by-step task cards and a choice of how to show learning); individual adjustments follow CUD's student-support process.</w:t>
+        <w:t xml:space="preserve">The course is taught as a weekly 1-hour lecture and a 2-hour lab (1-2-2). In the lecture, the instructor presents one concept from the textbook with real UAE examples and the framework applied step by step. In the lab, students apply it in one hands-on activity (Section 4.1), in teams with rotating roles (leader, timekeeper, recorder, speaker), and keep a teamwork log.</w:t>
+      </w:r>
+    </w:p>
+    <w:p>
+      <w:pPr>
+        <w:spacing w:after="120" w:line="240" w:lineRule="auto"/>
+        <w:jc w:val="both"/>
+        <w:rPr>
+          <w:rFonts w:cstheme="minorHAnsi"/>
+          <w:color w:val="000000" w:themeColor="text1"/>
+          <w:sz w:val="24"/>
+          <w:szCs w:val="24"/>
+        </w:rPr>
+      </w:pPr>
+      <w:r>
+        <w:rPr>
+          <w:rFonts w:cstheme="minorHAnsi"/>
+          <w:color w:val="000000" w:themeColor="text1"/>
+          <w:sz w:val="24"/>
+          <w:szCs w:val="24"/>
+          <w:b w:val="0"/>
+        </w:rPr>
+        <w:t xml:space="preserve">Some lectures or labs may include a short contribution from a practising entrepreneur or a CUD Incubator partner, within the scheduled class time; this does not add contact hours and does not replace the lecture or the lab.</w:t>
+      </w:r>
+    </w:p>
+    <w:p>
+      <w:pPr>
+        <w:spacing w:after="120" w:line="240" w:lineRule="auto"/>
+        <w:jc w:val="both"/>
+        <w:rPr>
+          <w:rFonts w:cstheme="minorHAnsi"/>
+          <w:color w:val="000000" w:themeColor="text1"/>
+          <w:sz w:val="24"/>
+          <w:szCs w:val="24"/>
+        </w:rPr>
+      </w:pPr>
+      <w:r>
+        <w:rPr>
+          <w:rFonts w:cstheme="minorHAnsi"/>
+          <w:color w:val="000000" w:themeColor="text1"/>
+          <w:sz w:val="24"/>
+          <w:szCs w:val="24"/>
+          <w:b w:val="0"/>
+        </w:rPr>
+        <w:t xml:space="preserve">Students are encouraged to take part in hackathons, innovation challenges and competitions at CUD and UAE level.</w:t>
+      </w:r>
+    </w:p>
+    <w:p>
+      <w:pPr>
+        <w:spacing w:after="120" w:line="240" w:lineRule="auto"/>
+        <w:jc w:val="both"/>
+        <w:rPr>
+          <w:rFonts w:cstheme="minorHAnsi"/>
+          <w:color w:val="000000" w:themeColor="text1"/>
+          <w:sz w:val="24"/>
+          <w:szCs w:val="24"/>
+        </w:rPr>
+      </w:pPr>
+      <w:r>
+        <w:rPr>
+          <w:rFonts w:cstheme="minorHAnsi"/>
+          <w:color w:val="000000" w:themeColor="text1"/>
+          <w:sz w:val="24"/>
+          <w:szCs w:val="24"/>
+          <w:b/>
+        </w:rPr>
+        <w:t xml:space="preserve">Inclusive learning: </w:t>
+      </w:r>
+      <w:r>
+        <w:rPr>
+          <w:rFonts w:cstheme="minorHAnsi"/>
+          <w:color w:val="000000" w:themeColor="text1"/>
+          <w:sz w:val="24"/>
+          <w:szCs w:val="24"/>
+          <w:b w:val="0"/>
+        </w:rPr>
+        <w:t xml:space="preserve">Materials follow Universal Design for Learning: a simplified Easy view, read-aloud, step-by-step task cards and a choice of how to show learning. Individual adjustments follow CUD's student-support process.</w:t>
       </w:r>
     </w:p>
     <w:p>
@@ -6297,7 +6436,7 @@
           <w:sz w:val="24"/>
           <w:szCs w:val="24"/>
         </w:rPr>
-        <w:t xml:space="preserve">Traifeh, H., Abou Refaei, R., von Thienen, J., von Schmieden, K., Mayer, L., Osman, S., &amp; Meinel, C. (2021). Mapping Design Thinking in the Arab World. In Design Thinking Research. Springer, Cham. p. 41-60</w:t>
+        <w:t xml:space="preserve">Traifeh, H., Abou Refaei, R., von Thienen, J., von Schmieden, K., Mayer, L., Osman, S., &amp; Meinel, C. (2021). Mapping Design Thinking in the Arab World. In Design Thinking Research. Springer, Cham. p. 41-60.</w:t>
       </w:r>
     </w:p>
     <w:p>
@@ -9884,7 +10023,7 @@
                 <w:sz w:val="16"/>
                 <w:szCs w:val="16"/>
               </w:rPr>
-              <w:t xml:space="preserve">Excellent (100 – 81%)</w:t>
+              <w:t xml:space="preserve">Excellent (100–81%)</w:t>
             </w:r>
           </w:p>
         </w:tc>
@@ -9912,7 +10051,7 @@
                 <w:sz w:val="16"/>
                 <w:szCs w:val="16"/>
               </w:rPr>
-              <w:t xml:space="preserve">Good (80 – 61%)</w:t>
+              <w:t xml:space="preserve">Good (80–61%)</w:t>
             </w:r>
           </w:p>
         </w:tc>
@@ -9939,7 +10078,7 @@
                 <w:sz w:val="16"/>
                 <w:szCs w:val="16"/>
               </w:rPr>
-              <w:t xml:space="preserve">Developing (60 – 41%)</w:t>
+              <w:t xml:space="preserve">Developing (60–41%)</w:t>
             </w:r>
           </w:p>
         </w:tc>
@@ -9966,7 +10105,7 @@
                 <w:sz w:val="16"/>
                 <w:szCs w:val="16"/>
               </w:rPr>
-              <w:t xml:space="preserve">Weak (40 – 0%)</w:t>
+              <w:t xml:space="preserve">Weak (40–0%)</w:t>
             </w:r>
           </w:p>
         </w:tc>
@@ -10656,7 +10795,7 @@
                 <w:sz w:val="16"/>
                 <w:szCs w:val="16"/>
               </w:rPr>
-              <w:t xml:space="preserve">Excellent (100 – 81%)</w:t>
+              <w:t xml:space="preserve">Excellent (100–81%)</w:t>
             </w:r>
           </w:p>
         </w:tc>
@@ -10684,7 +10823,7 @@
                 <w:sz w:val="16"/>
                 <w:szCs w:val="16"/>
               </w:rPr>
-              <w:t xml:space="preserve">Good (80 – 61%)</w:t>
+              <w:t xml:space="preserve">Good (80–61%)</w:t>
             </w:r>
           </w:p>
         </w:tc>
@@ -10711,7 +10850,7 @@
                 <w:sz w:val="16"/>
                 <w:szCs w:val="16"/>
               </w:rPr>
-              <w:t xml:space="preserve">Developing (60 – 41%)</w:t>
+              <w:t xml:space="preserve">Developing (60–41%)</w:t>
             </w:r>
           </w:p>
         </w:tc>
@@ -10738,7 +10877,7 @@
                 <w:sz w:val="16"/>
                 <w:szCs w:val="16"/>
               </w:rPr>
-              <w:t xml:space="preserve">Weak (40 – 0%)</w:t>
+              <w:t xml:space="preserve">Weak (40–0%)</w:t>
             </w:r>
           </w:p>
         </w:tc>
@@ -11428,7 +11567,7 @@
                 <w:sz w:val="16"/>
                 <w:szCs w:val="16"/>
               </w:rPr>
-              <w:t xml:space="preserve">Excellent (100 – 81%)</w:t>
+              <w:t xml:space="preserve">Excellent (100–81%)</w:t>
             </w:r>
           </w:p>
         </w:tc>
@@ -11456,7 +11595,7 @@
                 <w:sz w:val="16"/>
                 <w:szCs w:val="16"/>
               </w:rPr>
-              <w:t xml:space="preserve">Good (80 – 61%)</w:t>
+              <w:t xml:space="preserve">Good (80–61%)</w:t>
             </w:r>
           </w:p>
         </w:tc>
@@ -11483,7 +11622,7 @@
                 <w:sz w:val="16"/>
                 <w:szCs w:val="16"/>
               </w:rPr>
-              <w:t xml:space="preserve">Developing (60 – 41%)</w:t>
+              <w:t xml:space="preserve">Developing (60–41%)</w:t>
             </w:r>
           </w:p>
         </w:tc>
@@ -11510,7 +11649,7 @@
                 <w:sz w:val="16"/>
                 <w:szCs w:val="16"/>
               </w:rPr>
-              <w:t xml:space="preserve">Weak (40 – 0%)</w:t>
+              <w:t xml:space="preserve">Weak (40–0%)</w:t>
             </w:r>
           </w:p>
         </w:tc>
@@ -12200,7 +12339,7 @@
                 <w:sz w:val="16"/>
                 <w:szCs w:val="16"/>
               </w:rPr>
-              <w:t xml:space="preserve">Excellent (100 – 81%)</w:t>
+              <w:t xml:space="preserve">Excellent (100–81%)</w:t>
             </w:r>
           </w:p>
         </w:tc>
@@ -12228,7 +12367,7 @@
                 <w:sz w:val="16"/>
                 <w:szCs w:val="16"/>
               </w:rPr>
-              <w:t xml:space="preserve">Good (80 – 61%)</w:t>
+              <w:t xml:space="preserve">Good (80–61%)</w:t>
             </w:r>
           </w:p>
         </w:tc>
@@ -12255,7 +12394,7 @@
                 <w:sz w:val="16"/>
                 <w:szCs w:val="16"/>
               </w:rPr>
-              <w:t xml:space="preserve">Developing (60 – 41%)</w:t>
+              <w:t xml:space="preserve">Developing (60–41%)</w:t>
             </w:r>
           </w:p>
         </w:tc>
@@ -12282,7 +12421,7 @@
                 <w:sz w:val="16"/>
                 <w:szCs w:val="16"/>
               </w:rPr>
-              <w:t xml:space="preserve">Weak (40 – 0%)</w:t>
+              <w:t xml:space="preserve">Weak (40–0%)</w:t>
             </w:r>
           </w:p>
         </w:tc>

</xml_diff>